<commit_message>
docs(rescue): document captured CUT signals as advisory rescue candidates
CLAUDE.md rescue section + User Guide note (rebuilt html/docx).

Co-Authored-By: Claude Opus 4.8 <noreply@anthropic.com>
</commit_message>
<xml_diff>
--- a/docs/manuals/user-guide/user-guide.docx
+++ b/docs/manuals/user-guide/user-guide.docx
@@ -3490,11 +3490,45 @@
       </w:r>
       <w:r>
         <w:rPr/>
-        <w:t xml:space="preserve"> They appear in the at-risk table and get a</w:t>
+        <w:t xml:space="preserve"> A captured signal that turns at-risk — for</w:t>
         <w:br/>
-        <w:t>full candidate menu, but they have no Apply button — there's no paper position to</w:t>
+        <w:t xml:space="preserve">example one showing a </w:t>
+      </w:r>
+      <w:r>
+        <w:rPr>
+          <w:b/>
+        </w:rPr>
+        <w:t>CUT</w:t>
+      </w:r>
+      <w:r>
+        <w:rPr/>
+        <w:t xml:space="preserve"> recommendation (a money/delta/time stop) — appears in the</w:t>
         <w:br/>
-        <w:t>mutate. Use the menu as guidance and place the adjustment yourself.</w:t>
+        <w:t xml:space="preserve">at-risk table and gets a full candidate menu, but it has </w:t>
+      </w:r>
+      <w:r>
+        <w:rPr>
+          <w:b/>
+        </w:rPr>
+        <w:t>no Apply button</w:t>
+      </w:r>
+      <w:r>
+        <w:rPr/>
+        <w:t xml:space="preserve"> (there's no</w:t>
+        <w:br/>
+        <w:t>paper position to mutate). Use the menu as guidance and place the adjustment yourself.</w:t>
+        <w:br/>
+        <w:t xml:space="preserve">Captured signals do </w:t>
+      </w:r>
+      <w:r>
+        <w:rPr>
+          <w:b/>
+        </w:rPr>
+        <w:t>not</w:t>
+      </w:r>
+      <w:r>
+        <w:rPr/>
+        <w:t xml:space="preserve"> add to the Rescue nav badge (that counts paper positions).</w:t>
       </w:r>
     </w:p>
     <w:p>

</xml_diff>

<commit_message>
docs(shares): say that a covering call is matched per symbol, not per lot
The Reference Guide already carried this; the hover guide and the User Guide did
not, and both describe the column as "the call written against that symbol"
without saying what happens when you hold two lots of one name. The paper book
records no link from a call back to the shares it was written against, so the
same call renders on every lot of the symbol -- a reader with two lots and one
call cannot tell which hundred shares are covered, and neither can the book.

Both were audited alongside the Income entries, which were accurate as written:
the covered-call structure and the two new ratio columns are present in
page_help, the User Guide and the Reference Guide.

user-guide.html/.docx rebuilt with build_docs.py; the diff is the one paragraph.

Co-Authored-By: Claude Opus 5 <noreply@anthropic.com>
</commit_message>
<xml_diff>
--- a/docs/manuals/user-guide/user-guide.docx
+++ b/docs/manuals/user-guide/user-guide.docx
@@ -9987,7 +9987,21 @@
         <w:rPr/>
         <w:t xml:space="preserve"> on the same symbol is not a covering call and is not shown</w:t>
         <w:br/>
-        <w:t>here.</w:t>
+        <w:t xml:space="preserve">here. The match is by </w:t>
+      </w:r>
+      <w:r>
+        <w:rPr>
+          <w:b/>
+        </w:rPr>
+        <w:t>symbol, not by lot</w:t>
+      </w:r>
+      <w:r>
+        <w:rPr/>
+        <w:t xml:space="preserve"> — the book keeps no record of which</w:t>
+        <w:br/>
+        <w:t>shares a call was written against — so if you hold two lots of one name and have</w:t>
+        <w:br/>
+        <w:t>written one call, that call appears on both rows.</w:t>
       </w:r>
     </w:p>
     <w:p>

</xml_diff>